<commit_message>
docs: personalize cover page with MD IQBAL 1BM23AI099
</commit_message>
<xml_diff>
--- a/AAT_Report_Hallucination_Detection.docx
+++ b/AAT_Report_Hallucination_Detection.docx
@@ -134,7 +134,7 @@
           <w:p>
             <w:r>
               <w:br/>
-              <w:t>[Team Member 1 Name]</w:t>
+              <w:t>MD IQBAL</w:t>
               <w:br/>
               <w:t>[Team Member 2 Name]</w:t>
             </w:r>
@@ -175,7 +175,7 @@
           <w:p>
             <w:r>
               <w:br/>
-              <w:t>1BM23AI...</w:t>
+              <w:t>1BM23AI099</w:t>
               <w:br/>
               <w:t>1BM23AI...</w:t>
             </w:r>

</xml_diff>